<commit_message>
Route en informartie mindervaliden aangepast
</commit_message>
<xml_diff>
--- a/assets/routes/route-mindervalide-dinsdag.docx
+++ b/assets/routes/route-mindervalide-dinsdag.docx
@@ -108,7 +108,7 @@
           <w:szCs w:val="24"/>
           <w:lang w:val="nl-NL"/>
         </w:rPr>
-        <w:t>10 juni</w:t>
+        <w:t>26 mei 2026</w:t>
       </w:r>
       <w:r>
         <w:rPr>
@@ -206,8 +206,36 @@
           <w:color w:val="000000"/>
           <w:lang w:val="nl-NL"/>
         </w:rPr>
-        <w:t>Vertrekpunt de hoofdingang van de Scholtenhof/Mariahof naar de Watertoren</w:t>
-      </w:r>
+        <w:t xml:space="preserve">Vertrekpunt de hoofdingang van de </w:t>
+      </w:r>
+      <w:proofErr w:type="spellStart"/>
+      <w:r>
+        <w:rPr>
+          <w:rFonts w:ascii="Calibri" w:eastAsia="Calibri" w:hAnsi="Calibri" w:cs="Calibri"/>
+          <w:color w:val="000000"/>
+          <w:lang w:val="nl-NL"/>
+        </w:rPr>
+        <w:t>Scholtenhof</w:t>
+      </w:r>
+      <w:proofErr w:type="spellEnd"/>
+      <w:r>
+        <w:rPr>
+          <w:rFonts w:ascii="Calibri" w:eastAsia="Calibri" w:hAnsi="Calibri" w:cs="Calibri"/>
+          <w:color w:val="000000"/>
+          <w:lang w:val="nl-NL"/>
+        </w:rPr>
+        <w:t>/</w:t>
+      </w:r>
+      <w:proofErr w:type="spellStart"/>
+      <w:r>
+        <w:rPr>
+          <w:rFonts w:ascii="Calibri" w:eastAsia="Calibri" w:hAnsi="Calibri" w:cs="Calibri"/>
+          <w:color w:val="000000"/>
+          <w:lang w:val="nl-NL"/>
+        </w:rPr>
+        <w:t>Mariahof</w:t>
+      </w:r>
+      <w:proofErr w:type="spellEnd"/>
     </w:p>
     <w:p>
       <w:pPr>
@@ -313,7 +341,15 @@
           <w:color w:val="000000"/>
           <w:lang w:val="nl-NL"/>
         </w:rPr>
-        <w:t>Haerstraat, via de Groene Loper oversteken (bij het station vertrekken de deelnemers van de Oldenzaalse Wandel4Ddaagse).</w:t>
+        <w:t>Haerstraat, via de Groene Loper oversteken</w:t>
+      </w:r>
+      <w:r>
+        <w:rPr>
+          <w:rFonts w:ascii="Calibri" w:eastAsia="Calibri" w:hAnsi="Calibri" w:cs="Calibri"/>
+          <w:color w:val="000000"/>
+          <w:lang w:val="nl-NL"/>
+        </w:rPr>
+        <w:t>.</w:t>
       </w:r>
     </w:p>
     <w:p>
@@ -359,7 +395,25 @@
           <w:color w:val="000000"/>
           <w:lang w:val="nl-NL"/>
         </w:rPr>
-        <w:t>Voor het gebouw van Breedwijs het park inlopen tot aan de muziekkoepel.</w:t>
+        <w:t xml:space="preserve">Voor het gebouw van </w:t>
+      </w:r>
+      <w:proofErr w:type="spellStart"/>
+      <w:r>
+        <w:rPr>
+          <w:rFonts w:ascii="Calibri" w:eastAsia="Calibri" w:hAnsi="Calibri" w:cs="Calibri"/>
+          <w:color w:val="000000"/>
+          <w:lang w:val="nl-NL"/>
+        </w:rPr>
+        <w:t>Breedwijs</w:t>
+      </w:r>
+      <w:proofErr w:type="spellEnd"/>
+      <w:r>
+        <w:rPr>
+          <w:rFonts w:ascii="Calibri" w:eastAsia="Calibri" w:hAnsi="Calibri" w:cs="Calibri"/>
+          <w:color w:val="000000"/>
+          <w:lang w:val="nl-NL"/>
+        </w:rPr>
+        <w:t xml:space="preserve"> het park inlopen tot aan de muziekkoepel.</w:t>
       </w:r>
     </w:p>
     <w:p>
@@ -432,7 +486,30 @@
           <w:color w:val="000000"/>
           <w:lang w:val="nl-NL"/>
         </w:rPr>
-        <w:t>De Bloemenkamplaan oversteken de Lijsterstraat in.</w:t>
+        <w:t xml:space="preserve">De </w:t>
+      </w:r>
+      <w:r>
+        <w:rPr>
+          <w:rFonts w:ascii="Calibri" w:eastAsia="Calibri" w:hAnsi="Calibri" w:cs="Calibri"/>
+          <w:color w:val="000000"/>
+        </w:rPr>
+        <w:t>Stakenkamplaan</w:t>
+      </w:r>
+      <w:r>
+        <w:rPr>
+          <w:rFonts w:ascii="Calibri" w:eastAsia="Calibri" w:hAnsi="Calibri" w:cs="Calibri"/>
+          <w:color w:val="000000"/>
+          <w:lang w:val="en-GB"/>
+        </w:rPr>
+        <w:t xml:space="preserve"> </w:t>
+      </w:r>
+      <w:r>
+        <w:rPr>
+          <w:rFonts w:ascii="Calibri" w:eastAsia="Calibri" w:hAnsi="Calibri" w:cs="Calibri"/>
+          <w:color w:val="000000"/>
+          <w:lang w:val="nl-NL"/>
+        </w:rPr>
+        <w:t>oversteken de Lijsterstraat in.</w:t>
       </w:r>
     </w:p>
     <w:p>
@@ -475,7 +552,25 @@
           <w:color w:val="000000"/>
           <w:lang w:val="nl-NL"/>
         </w:rPr>
-        <w:t>Burgemeester Wallerstraat.</w:t>
+        <w:t xml:space="preserve">Burgemeester </w:t>
+      </w:r>
+      <w:proofErr w:type="spellStart"/>
+      <w:r>
+        <w:rPr>
+          <w:rFonts w:ascii="Calibri" w:eastAsia="Calibri" w:hAnsi="Calibri" w:cs="Calibri"/>
+          <w:color w:val="000000"/>
+          <w:lang w:val="nl-NL"/>
+        </w:rPr>
+        <w:t>Wallerstraat</w:t>
+      </w:r>
+      <w:proofErr w:type="spellEnd"/>
+      <w:r>
+        <w:rPr>
+          <w:rFonts w:ascii="Calibri" w:eastAsia="Calibri" w:hAnsi="Calibri" w:cs="Calibri"/>
+          <w:color w:val="000000"/>
+          <w:lang w:val="nl-NL"/>
+        </w:rPr>
+        <w:t>.</w:t>
       </w:r>
     </w:p>
     <w:p>
@@ -498,7 +593,25 @@
           <w:color w:val="000000"/>
           <w:lang w:val="nl-NL"/>
         </w:rPr>
-        <w:t>Einde pad, rechtsaf de Burgemeester Wallerstraat op richting de rotonde.</w:t>
+        <w:t xml:space="preserve">Einde pad, rechtsaf de Burgemeester </w:t>
+      </w:r>
+      <w:proofErr w:type="spellStart"/>
+      <w:r>
+        <w:rPr>
+          <w:rFonts w:ascii="Calibri" w:eastAsia="Calibri" w:hAnsi="Calibri" w:cs="Calibri"/>
+          <w:color w:val="000000"/>
+          <w:lang w:val="nl-NL"/>
+        </w:rPr>
+        <w:t>Wallerstraat</w:t>
+      </w:r>
+      <w:proofErr w:type="spellEnd"/>
+      <w:r>
+        <w:rPr>
+          <w:rFonts w:ascii="Calibri" w:eastAsia="Calibri" w:hAnsi="Calibri" w:cs="Calibri"/>
+          <w:color w:val="000000"/>
+          <w:lang w:val="nl-NL"/>
+        </w:rPr>
+        <w:t xml:space="preserve"> op richting de rotonde.</w:t>
       </w:r>
     </w:p>
     <w:p>
@@ -1572,7 +1685,6 @@
   <w:style w:type="character" w:default="1" w:styleId="DefaultParagraphFont">
     <w:name w:val="Default Paragraph Font"/>
     <w:uiPriority w:val="1"/>
-    <w:semiHidden/>
     <w:unhideWhenUsed/>
   </w:style>
   <w:style w:type="table" w:default="1" w:styleId="TableNormal">

</xml_diff>

<commit_message>
Routes bijgewerkt en winacties
</commit_message>
<xml_diff>
--- a/assets/routes/route-mindervalide-dinsdag.docx
+++ b/assets/routes/route-mindervalide-dinsdag.docx
@@ -22,19 +22,13 @@
       </w:pPr>
       <w:r>
         <w:rPr>
-          <w:rFonts w:ascii="Calibri" w:eastAsia="Calibri" w:hAnsi="Calibri" w:cs="Calibri"/>
-          <w:b/>
           <w:noProof/>
-          <w:color w:val="000000"/>
-          <w:sz w:val="26"/>
-          <w:szCs w:val="24"/>
-          <w:lang w:val="nl-NL"/>
         </w:rPr>
         <w:drawing>
-          <wp:inline distT="0" distB="0" distL="0" distR="0" wp14:anchorId="603A3653" wp14:editId="3442EEBC">
-            <wp:extent cx="2552007" cy="1105593"/>
-            <wp:effectExtent l="0" t="0" r="1270" b="0"/>
-            <wp:docPr id="1738833055" name="Picture 2" descr="A logo for a church&#10;&#10;Description automatically generated"/>
+          <wp:inline distT="0" distB="0" distL="0" distR="0" wp14:anchorId="7A7C264E" wp14:editId="78F788DD">
+            <wp:extent cx="2227267" cy="944258"/>
+            <wp:effectExtent l="0" t="0" r="1905" b="8255"/>
+            <wp:docPr id="1295773447" name="Picture 1"/>
             <wp:cNvGraphicFramePr>
               <a:graphicFrameLocks xmlns:a="http://schemas.openxmlformats.org/drawingml/2006/main" noChangeAspect="1"/>
             </wp:cNvGraphicFramePr>
@@ -42,29 +36,36 @@
               <a:graphicData uri="http://schemas.openxmlformats.org/drawingml/2006/picture">
                 <pic:pic xmlns:pic="http://schemas.openxmlformats.org/drawingml/2006/picture">
                   <pic:nvPicPr>
-                    <pic:cNvPr id="1738833055" name="Picture 2" descr="A logo for a church&#10;&#10;Description automatically generated"/>
-                    <pic:cNvPicPr/>
+                    <pic:cNvPr id="0" name="Picture 1"/>
+                    <pic:cNvPicPr>
+                      <a:picLocks noChangeAspect="1" noChangeArrowheads="1"/>
+                    </pic:cNvPicPr>
                   </pic:nvPicPr>
                   <pic:blipFill>
-                    <a:blip r:embed="rId5">
+                    <a:blip r:embed="rId5" cstate="print">
                       <a:extLst>
                         <a:ext uri="{28A0092B-C50C-407E-A947-70E740481C1C}">
                           <a14:useLocalDpi xmlns:a14="http://schemas.microsoft.com/office/drawing/2010/main" val="0"/>
                         </a:ext>
                       </a:extLst>
                     </a:blip>
+                    <a:srcRect/>
                     <a:stretch>
                       <a:fillRect/>
                     </a:stretch>
                   </pic:blipFill>
-                  <pic:spPr>
+                  <pic:spPr bwMode="auto">
                     <a:xfrm>
                       <a:off x="0" y="0"/>
-                      <a:ext cx="2552007" cy="1105593"/>
+                      <a:ext cx="2236740" cy="948274"/>
                     </a:xfrm>
                     <a:prstGeom prst="rect">
                       <a:avLst/>
                     </a:prstGeom>
+                    <a:noFill/>
+                    <a:ln>
+                      <a:noFill/>
+                    </a:ln>
                   </pic:spPr>
                 </pic:pic>
               </a:graphicData>
@@ -1685,6 +1686,7 @@
   <w:style w:type="character" w:default="1" w:styleId="DefaultParagraphFont">
     <w:name w:val="Default Paragraph Font"/>
     <w:uiPriority w:val="1"/>
+    <w:semiHidden/>
     <w:unhideWhenUsed/>
   </w:style>
   <w:style w:type="table" w:default="1" w:styleId="TableNormal">

</xml_diff>